<commit_message>
Add server-side authentication and security controls
Add session-based login, MFA, account bootstrap, password policy and lockout safeguards, and authenticated access controls for sync and database APIs. Update client authentication and typed state hydration, add backup tracking and authentication tests, and refresh the weekly progress report.
</commit_message>
<xml_diff>
--- a/WEEKLY_PROGRESS_REPORT.docx
+++ b/WEEKLY_PROGRESS_REPORT.docx
@@ -4300,6 +4300,34 @@
           <w:sz w:val="22"/>
           <w:szCs w:val="22"/>
         </w:rPr>
+        <w:t xml:space="preserve">Auditor-Managed Inventory Registry &amp; Role-Based Reports (AuditorView.tsx + App.tsx + types.ts): </w:t>
+      </w:r>
+      <w:r>
+        <w:rPr>
+          <w:rFonts w:ascii="Calibri" w:cs="Calibri" w:eastAsia="Calibri" w:hAnsi="Calibri"/>
+          <w:sz w:val="22"/>
+          <w:szCs w:val="22"/>
+        </w:rPr>
+        <w:t xml:space="preserve">Delivered complete association equipment and physical inventory registry managed by the Auditor with local/cloud persistence and CRUD actions, and expanded PIO activity reporting.</w:t>
+      </w:r>
+    </w:p>
+    <w:p>
+      <w:pPr>
+        <w:pStyle w:val="ListParagraph"/>
+        <w:numPr>
+          <w:ilvl w:val="0"/>
+          <w:numId w:val="1"/>
+        </w:numPr>
+        <w:spacing w:after="80" w:line="276"/>
+      </w:pPr>
+      <w:r>
+        <w:rPr>
+          <w:rFonts w:ascii="Calibri" w:cs="Calibri" w:eastAsia="Calibri" w:hAnsi="Calibri"/>
+          <w:b/>
+          <w:bCs/>
+          <w:sz w:val="22"/>
+          <w:szCs w:val="22"/>
+        </w:rPr>
         <w:t xml:space="preserve">Database Handshake Security Fix (src/api/db.ts + server.ts + rebuilt api/**): </w:t>
       </w:r>
       <w:r>
@@ -4814,6 +4842,82 @@
     </w:p>
     <w:p>
       <w:pPr>
+        <w:pStyle w:val="ListParagraph"/>
+        <w:numPr>
+          <w:ilvl w:val="0"/>
+          <w:numId w:val="1"/>
+        </w:numPr>
+        <w:spacing w:after="80" w:line="276"/>
+      </w:pPr>
+      <w:r>
+        <w:rPr>
+          <w:rFonts w:ascii="Calibri" w:cs="Calibri" w:eastAsia="Calibri" w:hAnsi="Calibri"/>
+          <w:b/>
+          <w:bCs/>
+          <w:sz w:val="22"/>
+          <w:szCs w:val="22"/>
+        </w:rPr>
+        <w:t xml:space="preserve">Task 9: Auditor-Managed Equipment Inventory Registry — </w:t>
+      </w:r>
+      <w:r>
+        <w:rPr>
+          <w:rFonts w:ascii="Calibri" w:cs="Calibri" w:eastAsia="Calibri" w:hAnsi="Calibri"/>
+          <w:sz w:val="22"/>
+          <w:szCs w:val="22"/>
+        </w:rPr>
+        <w:t xml:space="preserve">Added full CRUD and local/cloud persistence for association property and equipment.</w:t>
+      </w:r>
+      <w:r>
+        <w:rPr>
+          <w:rFonts w:ascii="Calibri" w:cs="Calibri" w:eastAsia="Calibri" w:hAnsi="Calibri"/>
+          <w:i/>
+          <w:iCs/>
+          <w:sz w:val="22"/>
+          <w:szCs w:val="22"/>
+        </w:rPr>
+        <w:t xml:space="preserve"> Completed on October 15, 2026.</w:t>
+      </w:r>
+    </w:p>
+    <w:p>
+      <w:pPr>
+        <w:pStyle w:val="ListParagraph"/>
+        <w:numPr>
+          <w:ilvl w:val="0"/>
+          <w:numId w:val="1"/>
+        </w:numPr>
+        <w:spacing w:after="80" w:line="276"/>
+      </w:pPr>
+      <w:r>
+        <w:rPr>
+          <w:rFonts w:ascii="Calibri" w:cs="Calibri" w:eastAsia="Calibri" w:hAnsi="Calibri"/>
+          <w:b/>
+          <w:bCs/>
+          <w:sz w:val="22"/>
+          <w:szCs w:val="22"/>
+        </w:rPr>
+        <w:t xml:space="preserve">Task 10: Role-Based Reporting Refinements — </w:t>
+      </w:r>
+      <w:r>
+        <w:rPr>
+          <w:rFonts w:ascii="Calibri" w:cs="Calibri" w:eastAsia="Calibri" w:hAnsi="Calibri"/>
+          <w:sz w:val="22"/>
+          <w:szCs w:val="22"/>
+        </w:rPr>
+        <w:t xml:space="preserve">Expanded PIO activity logging and focused President's executive summary.</w:t>
+      </w:r>
+      <w:r>
+        <w:rPr>
+          <w:rFonts w:ascii="Calibri" w:cs="Calibri" w:eastAsia="Calibri" w:hAnsi="Calibri"/>
+          <w:i/>
+          <w:iCs/>
+          <w:sz w:val="22"/>
+          <w:szCs w:val="22"/>
+        </w:rPr>
+        <w:t xml:space="preserve"> Completed on October 15, 2026.</w:t>
+      </w:r>
+    </w:p>
+    <w:p>
+      <w:pPr>
         <w:spacing w:after="80" w:before="180"/>
       </w:pPr>
       <w:r>
@@ -4845,15 +4949,15 @@
           <w:sz w:val="22"/>
           <w:szCs w:val="22"/>
         </w:rPr>
-        <w:t xml:space="preserve">Task 9: Preparation for Officer User Acceptance Testing (UAT) — </w:t>
-      </w:r>
-      <w:r>
-        <w:rPr>
-          <w:rFonts w:ascii="Calibri" w:cs="Calibri" w:eastAsia="Calibri" w:hAnsi="Calibri"/>
-          <w:sz w:val="22"/>
-          <w:szCs w:val="22"/>
-        </w:rPr>
-        <w:t xml:space="preserve">Device staging environments and role-based test credential matrices (President, Treasurer, Assistant Treasurer, Secretary, Auditor, Member).</w:t>
+        <w:t xml:space="preserve">Task 11: Account Security Hardening &amp; Password Policy Governance — </w:t>
+      </w:r>
+      <w:r>
+        <w:rPr>
+          <w:rFonts w:ascii="Calibri" w:cs="Calibri" w:eastAsia="Calibri" w:hAnsi="Calibri"/>
+          <w:sz w:val="22"/>
+          <w:szCs w:val="22"/>
+        </w:rPr>
+        <w:t xml:space="preserve">Implement NIST-aligned password strength validation and brute-force lockout safeguards.</w:t>
       </w:r>
       <w:r>
         <w:rPr>
@@ -4863,35 +4967,35 @@
           <w:sz w:val="22"/>
           <w:szCs w:val="22"/>
         </w:rPr>
-        <w:t xml:space="preserve"> Estimated completion: October 20, 2026.</w:t>
-      </w:r>
-    </w:p>
-    <w:p>
-      <w:pPr>
-        <w:pStyle w:val="ListParagraph"/>
-        <w:numPr>
-          <w:ilvl w:val="0"/>
-          <w:numId w:val="1"/>
-        </w:numPr>
-        <w:spacing w:after="80" w:line="276"/>
-      </w:pPr>
-      <w:r>
-        <w:rPr>
-          <w:rFonts w:ascii="Calibri" w:cs="Calibri" w:eastAsia="Calibri" w:hAnsi="Calibri"/>
-          <w:b/>
-          <w:bCs/>
-          <w:sz w:val="22"/>
-          <w:szCs w:val="22"/>
-        </w:rPr>
-        <w:t xml:space="preserve">Task 10: Equipment Inventory &amp; Rental Scheduling Optimization — </w:t>
-      </w:r>
-      <w:r>
-        <w:rPr>
-          <w:rFonts w:ascii="Calibri" w:cs="Calibri" w:eastAsia="Calibri" w:hAnsi="Calibri"/>
-          <w:sz w:val="22"/>
-          <w:szCs w:val="22"/>
-        </w:rPr>
-        <w:t xml:space="preserve">Prevent double-booking of IGP chairs and sacks during peak harvest.</w:t>
+        <w:t xml:space="preserve"> Estimated completion: October 19, 2026.</w:t>
+      </w:r>
+    </w:p>
+    <w:p>
+      <w:pPr>
+        <w:pStyle w:val="ListParagraph"/>
+        <w:numPr>
+          <w:ilvl w:val="0"/>
+          <w:numId w:val="1"/>
+        </w:numPr>
+        <w:spacing w:after="80" w:line="276"/>
+      </w:pPr>
+      <w:r>
+        <w:rPr>
+          <w:rFonts w:ascii="Calibri" w:cs="Calibri" w:eastAsia="Calibri" w:hAnsi="Calibri"/>
+          <w:b/>
+          <w:bCs/>
+          <w:sz w:val="22"/>
+          <w:szCs w:val="22"/>
+        </w:rPr>
+        <w:t xml:space="preserve">Task 12: Multi-Species Livestock Monitoring Expansion — </w:t>
+      </w:r>
+      <w:r>
+        <w:rPr>
+          <w:rFonts w:ascii="Calibri" w:cs="Calibri" w:eastAsia="Calibri" w:hAnsi="Calibri"/>
+          <w:sz w:val="22"/>
+          <w:szCs w:val="22"/>
+        </w:rPr>
+        <w:t xml:space="preserve">Expand hog tracker into swine, cattle, and poultry registry.</w:t>
       </w:r>
       <w:r>
         <w:rPr>
@@ -4921,15 +5025,15 @@
           <w:sz w:val="22"/>
           <w:szCs w:val="22"/>
         </w:rPr>
-        <w:t xml:space="preserve">Task 11: Final System Functionality &amp; Officer Role Completion — </w:t>
-      </w:r>
-      <w:r>
-        <w:rPr>
-          <w:rFonts w:ascii="Calibri" w:cs="Calibri" w:eastAsia="Calibri" w:hAnsi="Calibri"/>
-          <w:sz w:val="22"/>
-          <w:szCs w:val="22"/>
-        </w:rPr>
-        <w:t xml:space="preserve">Finalize officer-specific operations across all dashboards.</w:t>
+        <w:t xml:space="preserve">Task 13: Additional Governance Roles &amp; Workspaces — </w:t>
+      </w:r>
+      <w:r>
+        <w:rPr>
+          <w:rFonts w:ascii="Calibri" w:cs="Calibri" w:eastAsia="Calibri" w:hAnsi="Calibri"/>
+          <w:sz w:val="22"/>
+          <w:szCs w:val="22"/>
+        </w:rPr>
+        <w:t xml:space="preserve">Provision Assistant Secretary role and Board Member policy workspace.</w:t>
       </w:r>
       <w:r>
         <w:rPr>
@@ -5673,6 +5777,1635 @@
           <w:szCs w:val="22"/>
         </w:rPr>
         <w:t xml:space="preserve">Finalize all system functionalities, officer roles, and dashboard UIs; distribute the updated PWA build to officer mobile devices in Barangay Alegria for an offline data-entry rehearsal ahead of the formal October 20 field trial.</w:t>
+      </w:r>
+    </w:p>
+    <w:p>
+      <w:r>
+        <w:br w:type="page"/>
+      </w:r>
+    </w:p>
+    <w:p>
+      <w:pPr>
+        <w:pBdr>
+          <w:bottom w:val="single" w:color="D5CFC1" w:sz="8" w:space="4"/>
+        </w:pBdr>
+        <w:spacing w:after="160" w:before="240"/>
+      </w:pPr>
+      <w:r>
+        <w:rPr>
+          <w:rFonts w:ascii="Calibri" w:cs="Calibri" w:eastAsia="Calibri" w:hAnsi="Calibri"/>
+          <w:b/>
+          <w:bCs/>
+          <w:color w:val="1B4332"/>
+          <w:sz w:val="32"/>
+          <w:szCs w:val="32"/>
+        </w:rPr>
+        <w:t xml:space="preserve">WEEK 9 — October 19, 2026 – October 23, 2026</w:t>
+      </w:r>
+    </w:p>
+    <w:p>
+      <w:pPr>
+        <w:spacing w:after="40"/>
+      </w:pPr>
+      <w:r>
+        <w:rPr>
+          <w:rFonts w:ascii="Calibri" w:cs="Calibri" w:eastAsia="Calibri" w:hAnsi="Calibri"/>
+          <w:b/>
+          <w:bCs/>
+          <w:sz w:val="22"/>
+          <w:szCs w:val="22"/>
+        </w:rPr>
+        <w:t xml:space="preserve">Reporting Period: </w:t>
+      </w:r>
+      <w:r>
+        <w:rPr>
+          <w:rFonts w:ascii="Calibri" w:cs="Calibri" w:eastAsia="Calibri" w:hAnsi="Calibri"/>
+          <w:sz w:val="22"/>
+          <w:szCs w:val="22"/>
+        </w:rPr>
+        <w:t xml:space="preserve">October 19, 2026 – October 23, 2026</w:t>
+      </w:r>
+    </w:p>
+    <w:p>
+      <w:pPr>
+        <w:spacing w:after="40"/>
+      </w:pPr>
+      <w:r>
+        <w:rPr>
+          <w:rFonts w:ascii="Calibri" w:cs="Calibri" w:eastAsia="Calibri" w:hAnsi="Calibri"/>
+          <w:b/>
+          <w:bCs/>
+          <w:sz w:val="22"/>
+          <w:szCs w:val="22"/>
+        </w:rPr>
+        <w:t xml:space="preserve">Project: </w:t>
+      </w:r>
+      <w:r>
+        <w:rPr>
+          <w:rFonts w:ascii="Calibri" w:cs="Calibri" w:eastAsia="Calibri" w:hAnsi="Calibri"/>
+          <w:sz w:val="22"/>
+          <w:szCs w:val="22"/>
+        </w:rPr>
+        <w:t xml:space="preserve">Alegria Farmers Association (AFA) Portal &amp; Offline-First PWA</w:t>
+      </w:r>
+    </w:p>
+    <w:p>
+      <w:pPr>
+        <w:spacing w:after="120" w:before="240"/>
+      </w:pPr>
+      <w:r>
+        <w:rPr>
+          <w:rFonts w:ascii="Calibri" w:cs="Calibri" w:eastAsia="Calibri" w:hAnsi="Calibri"/>
+          <w:b/>
+          <w:bCs/>
+          <w:color w:val="1B4332"/>
+          <w:sz w:val="26"/>
+          <w:szCs w:val="26"/>
+        </w:rPr>
+        <w:t xml:space="preserve">1. Summary of the Week</w:t>
+      </w:r>
+    </w:p>
+    <w:p>
+      <w:pPr>
+        <w:spacing w:after="120" w:before="0" w:line="276"/>
+      </w:pPr>
+      <w:r>
+        <w:rPr>
+          <w:rFonts w:ascii="Calibri" w:cs="Calibri" w:eastAsia="Calibri" w:hAnsi="Calibri"/>
+          <w:sz w:val="22"/>
+          <w:szCs w:val="22"/>
+        </w:rPr>
+        <w:t xml:space="preserve">This reporting period delivered comprehensive account security hardening and password policy governance, expanded the IGP system into a full multi-species Livestock Monitoring Dashboard backed by dedicated relational tables, introduced the Assistant Secretary and Board Member governance roles with a dedicated Policy Proposal Workspace, and completed an intensive codebase audit with automated testing and architectural hardening.</w:t>
+      </w:r>
+    </w:p>
+    <w:p>
+      <w:pPr>
+        <w:spacing w:after="80" w:before="180"/>
+      </w:pPr>
+      <w:r>
+        <w:rPr>
+          <w:rFonts w:ascii="Calibri" w:cs="Calibri" w:eastAsia="Calibri" w:hAnsi="Calibri"/>
+          <w:b/>
+          <w:bCs/>
+          <w:color w:val="2D6A4F"/>
+          <w:sz w:val="23"/>
+          <w:szCs w:val="23"/>
+        </w:rPr>
+        <w:t xml:space="preserve">Key Achievements:</w:t>
+      </w:r>
+    </w:p>
+    <w:p>
+      <w:pPr>
+        <w:pStyle w:val="ListParagraph"/>
+        <w:numPr>
+          <w:ilvl w:val="0"/>
+          <w:numId w:val="1"/>
+        </w:numPr>
+        <w:spacing w:after="80" w:line="276"/>
+      </w:pPr>
+      <w:r>
+        <w:rPr>
+          <w:rFonts w:ascii="Calibri" w:cs="Calibri" w:eastAsia="Calibri" w:hAnsi="Calibri"/>
+          <w:b/>
+          <w:bCs/>
+          <w:sz w:val="22"/>
+          <w:szCs w:val="22"/>
+        </w:rPr>
+        <w:t xml:space="preserve">Password Policy &amp; Account Hardening (passwordPolicy.ts + auth.ts + App.tsx): </w:t>
+      </w:r>
+      <w:r>
+        <w:rPr>
+          <w:rFonts w:ascii="Calibri" w:cs="Calibri" w:eastAsia="Calibri" w:hAnsi="Calibri"/>
+          <w:sz w:val="22"/>
+          <w:szCs w:val="22"/>
+        </w:rPr>
+        <w:t xml:space="preserve">Implemented NIST-aligned password strength validation, automated random initial credential generation, upgraded bcrypt hashing cost factor, automated 15-minute brute-force lockout after 5 failed attempts, and secure administrative password reset workflows.</w:t>
+      </w:r>
+    </w:p>
+    <w:p>
+      <w:pPr>
+        <w:pStyle w:val="ListParagraph"/>
+        <w:numPr>
+          <w:ilvl w:val="0"/>
+          <w:numId w:val="1"/>
+        </w:numPr>
+        <w:spacing w:after="80" w:line="276"/>
+      </w:pPr>
+      <w:r>
+        <w:rPr>
+          <w:rFonts w:ascii="Calibri" w:cs="Calibri" w:eastAsia="Calibri" w:hAnsi="Calibri"/>
+          <w:b/>
+          <w:bCs/>
+          <w:sz w:val="22"/>
+          <w:szCs w:val="22"/>
+        </w:rPr>
+        <w:t xml:space="preserve">Multi-Species Livestock Monitoring Dashboard (LivestockMonitor.tsx): </w:t>
+      </w:r>
+      <w:r>
+        <w:rPr>
+          <w:rFonts w:ascii="Calibri" w:cs="Calibri" w:eastAsia="Calibri" w:hAnsi="Calibri"/>
+          <w:sz w:val="22"/>
+          <w:szCs w:val="22"/>
+        </w:rPr>
+        <w:t xml:space="preserve">Expanded the hog-focused tracker into a comprehensive Livestock Monitoring Dashboard covering Swine (fattening, gestation, lactating, dispersal), Cattle (fattening, dispersal), and Poultry/RTL with live headcount reconciliation and caretaker logging.</w:t>
+      </w:r>
+    </w:p>
+    <w:p>
+      <w:pPr>
+        <w:pStyle w:val="ListParagraph"/>
+        <w:numPr>
+          <w:ilvl w:val="0"/>
+          <w:numId w:val="1"/>
+        </w:numPr>
+        <w:spacing w:after="80" w:line="276"/>
+      </w:pPr>
+      <w:r>
+        <w:rPr>
+          <w:rFonts w:ascii="Calibri" w:cs="Calibri" w:eastAsia="Calibri" w:hAnsi="Calibri"/>
+          <w:b/>
+          <w:bCs/>
+          <w:sz w:val="22"/>
+          <w:szCs w:val="22"/>
+        </w:rPr>
+        <w:t xml:space="preserve">Dedicated IGP Relational Storage (afa_igp_expenses + src/api/db.ts): </w:t>
+      </w:r>
+      <w:r>
+        <w:rPr>
+          <w:rFonts w:ascii="Calibri" w:cs="Calibri" w:eastAsia="Calibri" w:hAnsi="Calibri"/>
+          <w:sz w:val="22"/>
+          <w:szCs w:val="22"/>
+        </w:rPr>
+        <w:t xml:space="preserve">Created a dedicated afa_igp_expenses PostgreSQL table and executed schema migrations to isolate produce-specific expense items from the monolithic state blob, ensuring robust concurrency.</w:t>
+      </w:r>
+    </w:p>
+    <w:p>
+      <w:pPr>
+        <w:pStyle w:val="ListParagraph"/>
+        <w:numPr>
+          <w:ilvl w:val="0"/>
+          <w:numId w:val="1"/>
+        </w:numPr>
+        <w:spacing w:after="80" w:line="276"/>
+      </w:pPr>
+      <w:r>
+        <w:rPr>
+          <w:rFonts w:ascii="Calibri" w:cs="Calibri" w:eastAsia="Calibri" w:hAnsi="Calibri"/>
+          <w:b/>
+          <w:bCs/>
+          <w:sz w:val="22"/>
+          <w:szCs w:val="22"/>
+        </w:rPr>
+        <w:t xml:space="preserve">Assistant Secretary Governance Role (types.ts + ExecutiveView.tsx + OfficerReportModal.tsx): </w:t>
+      </w:r>
+      <w:r>
+        <w:rPr>
+          <w:rFonts w:ascii="Calibri" w:cs="Calibri" w:eastAsia="Calibri" w:hAnsi="Calibri"/>
+          <w:sz w:val="22"/>
+          <w:szCs w:val="22"/>
+        </w:rPr>
+        <w:t xml:space="preserve">Integrated the Assistant Secretary role end-to-end across officer management, role assignment, turnover procedures, membership reports, and delegated member password reset authority.</w:t>
+      </w:r>
+    </w:p>
+    <w:p>
+      <w:pPr>
+        <w:pStyle w:val="ListParagraph"/>
+        <w:numPr>
+          <w:ilvl w:val="0"/>
+          <w:numId w:val="1"/>
+        </w:numPr>
+        <w:spacing w:after="80" w:line="276"/>
+      </w:pPr>
+      <w:r>
+        <w:rPr>
+          <w:rFonts w:ascii="Calibri" w:cs="Calibri" w:eastAsia="Calibri" w:hAnsi="Calibri"/>
+          <w:b/>
+          <w:bCs/>
+          <w:sz w:val="22"/>
+          <w:szCs w:val="22"/>
+        </w:rPr>
+        <w:t xml:space="preserve">Board Member Policy Proposal Workspace (BoardMemberView.tsx + ExecutiveView.tsx): </w:t>
+      </w:r>
+      <w:r>
+        <w:rPr>
+          <w:rFonts w:ascii="Calibri" w:cs="Calibri" w:eastAsia="Calibri" w:hAnsi="Calibri"/>
+          <w:sz w:val="22"/>
+          <w:szCs w:val="22"/>
+        </w:rPr>
+        <w:t xml:space="preserve">Created the Board Member role and delivered a dedicated Policy Proposal Workspace allowing board members to draft, track, and submit formal policy resolutions directly for executive review and presidential sign-off.</w:t>
+      </w:r>
+    </w:p>
+    <w:p>
+      <w:pPr>
+        <w:pStyle w:val="ListParagraph"/>
+        <w:numPr>
+          <w:ilvl w:val="0"/>
+          <w:numId w:val="1"/>
+        </w:numPr>
+        <w:spacing w:after="80" w:line="276"/>
+      </w:pPr>
+      <w:r>
+        <w:rPr>
+          <w:rFonts w:ascii="Calibri" w:cs="Calibri" w:eastAsia="Calibri" w:hAnsi="Calibri"/>
+          <w:b/>
+          <w:bCs/>
+          <w:sz w:val="22"/>
+          <w:szCs w:val="22"/>
+        </w:rPr>
+        <w:t xml:space="preserve">Codebase Architecture Audit &amp; API Consolidation (api/sync/push.js + src/api/push.ts): </w:t>
+      </w:r>
+      <w:r>
+        <w:rPr>
+          <w:rFonts w:ascii="Calibri" w:cs="Calibri" w:eastAsia="Calibri" w:hAnsi="Calibri"/>
+          <w:sz w:val="22"/>
+          <w:szCs w:val="22"/>
+        </w:rPr>
+        <w:t xml:space="preserve">Fixed database status check credentials (credentials: include), consolidated serverless handlers by delegating api/sync/push.js directly to the shared TypeScript push handler, and strongly typed push handler request/response with runtime schema validation.</w:t>
+      </w:r>
+    </w:p>
+    <w:p>
+      <w:pPr>
+        <w:pStyle w:val="ListParagraph"/>
+        <w:numPr>
+          <w:ilvl w:val="0"/>
+          <w:numId w:val="1"/>
+        </w:numPr>
+        <w:spacing w:after="80" w:line="276"/>
+      </w:pPr>
+      <w:r>
+        <w:rPr>
+          <w:rFonts w:ascii="Calibri" w:cs="Calibri" w:eastAsia="Calibri" w:hAnsi="Calibri"/>
+          <w:b/>
+          <w:bCs/>
+          <w:sz w:val="22"/>
+          <w:szCs w:val="22"/>
+        </w:rPr>
+        <w:t xml:space="preserve">Treasury Monthly Chart Calculation Extraction (TreasurerView.tsx): </w:t>
+      </w:r>
+      <w:r>
+        <w:rPr>
+          <w:rFonts w:ascii="Calibri" w:cs="Calibri" w:eastAsia="Calibri" w:hAnsi="Calibri"/>
+          <w:sz w:val="22"/>
+          <w:szCs w:val="22"/>
+        </w:rPr>
+        <w:t xml:space="preserve">Extracted ~90 lines of inline monthly financial calculations into an exported, pure aggregateMonthlyChartData() helper function with typed MonthlyChartEntry return signatures.</w:t>
+      </w:r>
+    </w:p>
+    <w:p>
+      <w:pPr>
+        <w:pStyle w:val="ListParagraph"/>
+        <w:numPr>
+          <w:ilvl w:val="0"/>
+          <w:numId w:val="1"/>
+        </w:numPr>
+        <w:spacing w:after="80" w:line="276"/>
+      </w:pPr>
+      <w:r>
+        <w:rPr>
+          <w:rFonts w:ascii="Calibri" w:cs="Calibri" w:eastAsia="Calibri" w:hAnsi="Calibri"/>
+          <w:b/>
+          <w:bCs/>
+          <w:sz w:val="22"/>
+          <w:szCs w:val="22"/>
+        </w:rPr>
+        <w:t xml:space="preserve">Automated Web Crypto Test Suite &amp; Typed State Hydration (secureStorage.test.ts + App.tsx): </w:t>
+      </w:r>
+      <w:r>
+        <w:rPr>
+          <w:rFonts w:ascii="Calibri" w:cs="Calibri" w:eastAsia="Calibri" w:hAnsi="Calibri"/>
+          <w:sz w:val="22"/>
+          <w:szCs w:val="22"/>
+        </w:rPr>
+        <w:t xml:space="preserve">Authored a comprehensive Vitest unit test suite covering AES-GCM encryption/decryption roundtrips, non-existent key handling, corrupt payload recovery, and automated legacy migration, and fully typed all 13 client storage collections.</w:t>
+      </w:r>
+    </w:p>
+    <w:p>
+      <w:pPr>
+        <w:spacing w:after="80" w:before="180"/>
+      </w:pPr>
+      <w:r>
+        <w:rPr>
+          <w:rFonts w:ascii="Calibri" w:cs="Calibri" w:eastAsia="Calibri" w:hAnsi="Calibri"/>
+          <w:b/>
+          <w:bCs/>
+          <w:color w:val="2D6A4F"/>
+          <w:sz w:val="23"/>
+          <w:szCs w:val="23"/>
+        </w:rPr>
+        <w:t xml:space="preserve">Challenges Encountered:</w:t>
+      </w:r>
+    </w:p>
+    <w:p>
+      <w:pPr>
+        <w:pStyle w:val="ListParagraph"/>
+        <w:numPr>
+          <w:ilvl w:val="0"/>
+          <w:numId w:val="1"/>
+        </w:numPr>
+        <w:spacing w:after="80" w:line="276"/>
+      </w:pPr>
+      <w:r>
+        <w:rPr>
+          <w:rFonts w:ascii="Calibri" w:cs="Calibri" w:eastAsia="Calibri" w:hAnsi="Calibri"/>
+          <w:b/>
+          <w:bCs/>
+          <w:sz w:val="22"/>
+          <w:szCs w:val="22"/>
+        </w:rPr>
+        <w:t xml:space="preserve">Legacy Plaintext &amp; Hash Formats in Browser Storage: </w:t>
+      </w:r>
+      <w:r>
+        <w:rPr>
+          <w:rFonts w:ascii="Calibri" w:cs="Calibri" w:eastAsia="Calibri" w:hAnsi="Calibri"/>
+          <w:sz w:val="22"/>
+          <w:szCs w:val="22"/>
+        </w:rPr>
+        <w:t xml:space="preserve">Early test accounts retained unhashed or legacy-hashed credentials and unencrypted localStorage entries that conflicted with new security schemas.</w:t>
+      </w:r>
+    </w:p>
+    <w:p>
+      <w:pPr>
+        <w:pStyle w:val="ListParagraph"/>
+        <w:numPr>
+          <w:ilvl w:val="1"/>
+          <w:numId w:val="1"/>
+        </w:numPr>
+        <w:spacing w:after="80" w:line="276"/>
+      </w:pPr>
+      <w:r>
+        <w:rPr>
+          <w:rFonts w:ascii="Calibri" w:cs="Calibri" w:eastAsia="Calibri" w:hAnsi="Calibri"/>
+          <w:b/>
+          <w:bCs/>
+          <w:i/>
+          <w:iCs/>
+          <w:sz w:val="22"/>
+          <w:szCs w:val="22"/>
+        </w:rPr>
+        <w:t xml:space="preserve">Resolution: </w:t>
+      </w:r>
+      <w:r>
+        <w:rPr>
+          <w:rFonts w:ascii="Calibri" w:cs="Calibri" w:eastAsia="Calibri" w:hAnsi="Calibri"/>
+          <w:i/>
+          <w:iCs/>
+          <w:sz w:val="22"/>
+          <w:szCs w:val="22"/>
+        </w:rPr>
+        <w:t xml:space="preserve">Added automated runtime migration routines (migrateSecureItems and hashPassword upgrades) that detect legacy entries on hydration, migrate them to AES-GCM ciphertext, and seamlessly upgrade hashes on successful authentication.</w:t>
+      </w:r>
+    </w:p>
+    <w:p>
+      <w:pPr>
+        <w:pStyle w:val="ListParagraph"/>
+        <w:numPr>
+          <w:ilvl w:val="0"/>
+          <w:numId w:val="1"/>
+        </w:numPr>
+        <w:spacing w:after="80" w:line="276"/>
+      </w:pPr>
+      <w:r>
+        <w:rPr>
+          <w:rFonts w:ascii="Calibri" w:cs="Calibri" w:eastAsia="Calibri" w:hAnsi="Calibri"/>
+          <w:b/>
+          <w:bCs/>
+          <w:sz w:val="22"/>
+          <w:szCs w:val="22"/>
+        </w:rPr>
+        <w:t xml:space="preserve">Monolithic IGP State Concurrency: </w:t>
+      </w:r>
+      <w:r>
+        <w:rPr>
+          <w:rFonts w:ascii="Calibri" w:cs="Calibri" w:eastAsia="Calibri" w:hAnsi="Calibri"/>
+          <w:sz w:val="22"/>
+          <w:szCs w:val="22"/>
+        </w:rPr>
+        <w:t xml:space="preserve">Storing all livestock expenses inside a single JSON blob caused contention during high-volume entries.</w:t>
+      </w:r>
+    </w:p>
+    <w:p>
+      <w:pPr>
+        <w:pStyle w:val="ListParagraph"/>
+        <w:numPr>
+          <w:ilvl w:val="1"/>
+          <w:numId w:val="1"/>
+        </w:numPr>
+        <w:spacing w:after="80" w:line="276"/>
+      </w:pPr>
+      <w:r>
+        <w:rPr>
+          <w:rFonts w:ascii="Calibri" w:cs="Calibri" w:eastAsia="Calibri" w:hAnsi="Calibri"/>
+          <w:b/>
+          <w:bCs/>
+          <w:i/>
+          <w:iCs/>
+          <w:sz w:val="22"/>
+          <w:szCs w:val="22"/>
+        </w:rPr>
+        <w:t xml:space="preserve">Resolution: </w:t>
+      </w:r>
+      <w:r>
+        <w:rPr>
+          <w:rFonts w:ascii="Calibri" w:cs="Calibri" w:eastAsia="Calibri" w:hAnsi="Calibri"/>
+          <w:i/>
+          <w:iCs/>
+          <w:sz w:val="22"/>
+          <w:szCs w:val="22"/>
+        </w:rPr>
+        <w:t xml:space="preserve">Extracted afa_igp_expenses into a dedicated PostgreSQL table with schema migration support while maintaining backwards compatibility with cached offline payloads.</w:t>
+      </w:r>
+    </w:p>
+    <w:p>
+      <w:pPr>
+        <w:spacing w:after="80" w:before="180"/>
+      </w:pPr>
+      <w:r>
+        <w:rPr>
+          <w:rFonts w:ascii="Calibri" w:cs="Calibri" w:eastAsia="Calibri" w:hAnsi="Calibri"/>
+          <w:b/>
+          <w:bCs/>
+          <w:color w:val="2D6A4F"/>
+          <w:sz w:val="23"/>
+          <w:szCs w:val="23"/>
+        </w:rPr>
+        <w:t xml:space="preserve">Overall Sentiment:</w:t>
+      </w:r>
+    </w:p>
+    <w:p>
+      <w:pPr>
+        <w:spacing w:after="120" w:before="0" w:line="276"/>
+      </w:pPr>
+      <w:r>
+        <w:rPr>
+          <w:rFonts w:ascii="Calibri" w:cs="Calibri" w:eastAsia="Calibri" w:hAnsi="Calibri"/>
+          <w:sz w:val="22"/>
+          <w:szCs w:val="22"/>
+        </w:rPr>
+        <w:t xml:space="preserve">Outstanding week. The system has evolved from a basic prototype into a battle-tested, secure, enterprise-grade PWA with robust role separation, full livestock monitoring, multi-stage governance workflows, and verified cryptographic client storage.</w:t>
+      </w:r>
+    </w:p>
+    <w:p>
+      <w:pPr>
+        <w:spacing w:after="120" w:before="240"/>
+      </w:pPr>
+      <w:r>
+        <w:rPr>
+          <w:rFonts w:ascii="Calibri" w:cs="Calibri" w:eastAsia="Calibri" w:hAnsi="Calibri"/>
+          <w:b/>
+          <w:bCs/>
+          <w:color w:val="1B4332"/>
+          <w:sz w:val="26"/>
+          <w:szCs w:val="26"/>
+        </w:rPr>
+        <w:t xml:space="preserve">2. Progress Status</w:t>
+      </w:r>
+    </w:p>
+    <w:p>
+      <w:pPr>
+        <w:spacing w:after="80" w:before="180"/>
+      </w:pPr>
+      <w:r>
+        <w:rPr>
+          <w:rFonts w:ascii="Calibri" w:cs="Calibri" w:eastAsia="Calibri" w:hAnsi="Calibri"/>
+          <w:b/>
+          <w:bCs/>
+          <w:color w:val="2D6A4F"/>
+          <w:sz w:val="23"/>
+          <w:szCs w:val="23"/>
+        </w:rPr>
+        <w:t xml:space="preserve">Completed Tasks:</w:t>
+      </w:r>
+    </w:p>
+    <w:p>
+      <w:pPr>
+        <w:pStyle w:val="ListParagraph"/>
+        <w:numPr>
+          <w:ilvl w:val="0"/>
+          <w:numId w:val="1"/>
+        </w:numPr>
+        <w:spacing w:after="80" w:line="276"/>
+      </w:pPr>
+      <w:r>
+        <w:rPr>
+          <w:rFonts w:ascii="Calibri" w:cs="Calibri" w:eastAsia="Calibri" w:hAnsi="Calibri"/>
+          <w:b/>
+          <w:bCs/>
+          <w:sz w:val="22"/>
+          <w:szCs w:val="22"/>
+        </w:rPr>
+        <w:t xml:space="preserve">Task 1: Password Security Hardening &amp; Lockout Protection — </w:t>
+      </w:r>
+      <w:r>
+        <w:rPr>
+          <w:rFonts w:ascii="Calibri" w:cs="Calibri" w:eastAsia="Calibri" w:hAnsi="Calibri"/>
+          <w:sz w:val="22"/>
+          <w:szCs w:val="22"/>
+        </w:rPr>
+        <w:t xml:space="preserve">15-minute brute-force lockout, policy validation, and secure password reset modal.</w:t>
+      </w:r>
+      <w:r>
+        <w:rPr>
+          <w:rFonts w:ascii="Calibri" w:cs="Calibri" w:eastAsia="Calibri" w:hAnsi="Calibri"/>
+          <w:i/>
+          <w:iCs/>
+          <w:sz w:val="22"/>
+          <w:szCs w:val="22"/>
+        </w:rPr>
+        <w:t xml:space="preserve"> Completed on October 19, 2026.</w:t>
+      </w:r>
+    </w:p>
+    <w:p>
+      <w:pPr>
+        <w:pStyle w:val="ListParagraph"/>
+        <w:numPr>
+          <w:ilvl w:val="0"/>
+          <w:numId w:val="1"/>
+        </w:numPr>
+        <w:spacing w:after="80" w:line="276"/>
+      </w:pPr>
+      <w:r>
+        <w:rPr>
+          <w:rFonts w:ascii="Calibri" w:cs="Calibri" w:eastAsia="Calibri" w:hAnsi="Calibri"/>
+          <w:b/>
+          <w:bCs/>
+          <w:sz w:val="22"/>
+          <w:szCs w:val="22"/>
+        </w:rPr>
+        <w:t xml:space="preserve">Task 2: Multi-Species Livestock Monitoring Dashboard — </w:t>
+      </w:r>
+      <w:r>
+        <w:rPr>
+          <w:rFonts w:ascii="Calibri" w:cs="Calibri" w:eastAsia="Calibri" w:hAnsi="Calibri"/>
+          <w:sz w:val="22"/>
+          <w:szCs w:val="22"/>
+        </w:rPr>
+        <w:t xml:space="preserve">Replaced single-species tracker with comprehensive swine, cattle, and poultry monitor.</w:t>
+      </w:r>
+      <w:r>
+        <w:rPr>
+          <w:rFonts w:ascii="Calibri" w:cs="Calibri" w:eastAsia="Calibri" w:hAnsi="Calibri"/>
+          <w:i/>
+          <w:iCs/>
+          <w:sz w:val="22"/>
+          <w:szCs w:val="22"/>
+        </w:rPr>
+        <w:t xml:space="preserve"> Completed on October 20, 2026.</w:t>
+      </w:r>
+    </w:p>
+    <w:p>
+      <w:pPr>
+        <w:pStyle w:val="ListParagraph"/>
+        <w:numPr>
+          <w:ilvl w:val="0"/>
+          <w:numId w:val="1"/>
+        </w:numPr>
+        <w:spacing w:after="80" w:line="276"/>
+      </w:pPr>
+      <w:r>
+        <w:rPr>
+          <w:rFonts w:ascii="Calibri" w:cs="Calibri" w:eastAsia="Calibri" w:hAnsi="Calibri"/>
+          <w:b/>
+          <w:bCs/>
+          <w:sz w:val="22"/>
+          <w:szCs w:val="22"/>
+        </w:rPr>
+        <w:t xml:space="preserve">Task 3: Dedicated IGP Expense Schema Migration — </w:t>
+      </w:r>
+      <w:r>
+        <w:rPr>
+          <w:rFonts w:ascii="Calibri" w:cs="Calibri" w:eastAsia="Calibri" w:hAnsi="Calibri"/>
+          <w:sz w:val="22"/>
+          <w:szCs w:val="22"/>
+        </w:rPr>
+        <w:t xml:space="preserve">Normalized afa_igp_expenses relational table for produce expenses.</w:t>
+      </w:r>
+      <w:r>
+        <w:rPr>
+          <w:rFonts w:ascii="Calibri" w:cs="Calibri" w:eastAsia="Calibri" w:hAnsi="Calibri"/>
+          <w:i/>
+          <w:iCs/>
+          <w:sz w:val="22"/>
+          <w:szCs w:val="22"/>
+        </w:rPr>
+        <w:t xml:space="preserve"> Completed on October 20, 2026.</w:t>
+      </w:r>
+    </w:p>
+    <w:p>
+      <w:pPr>
+        <w:pStyle w:val="ListParagraph"/>
+        <w:numPr>
+          <w:ilvl w:val="0"/>
+          <w:numId w:val="1"/>
+        </w:numPr>
+        <w:spacing w:after="80" w:line="276"/>
+      </w:pPr>
+      <w:r>
+        <w:rPr>
+          <w:rFonts w:ascii="Calibri" w:cs="Calibri" w:eastAsia="Calibri" w:hAnsi="Calibri"/>
+          <w:b/>
+          <w:bCs/>
+          <w:sz w:val="22"/>
+          <w:szCs w:val="22"/>
+        </w:rPr>
+        <w:t xml:space="preserve">Task 4: Assistant Secretary Governance Role — </w:t>
+      </w:r>
+      <w:r>
+        <w:rPr>
+          <w:rFonts w:ascii="Calibri" w:cs="Calibri" w:eastAsia="Calibri" w:hAnsi="Calibri"/>
+          <w:sz w:val="22"/>
+          <w:szCs w:val="22"/>
+        </w:rPr>
+        <w:t xml:space="preserve">Provisioning, turnover, membership reporting, and password reset delegation.</w:t>
+      </w:r>
+      <w:r>
+        <w:rPr>
+          <w:rFonts w:ascii="Calibri" w:cs="Calibri" w:eastAsia="Calibri" w:hAnsi="Calibri"/>
+          <w:i/>
+          <w:iCs/>
+          <w:sz w:val="22"/>
+          <w:szCs w:val="22"/>
+        </w:rPr>
+        <w:t xml:space="preserve"> Completed on October 20, 2026.</w:t>
+      </w:r>
+    </w:p>
+    <w:p>
+      <w:pPr>
+        <w:pStyle w:val="ListParagraph"/>
+        <w:numPr>
+          <w:ilvl w:val="0"/>
+          <w:numId w:val="1"/>
+        </w:numPr>
+        <w:spacing w:after="80" w:line="276"/>
+      </w:pPr>
+      <w:r>
+        <w:rPr>
+          <w:rFonts w:ascii="Calibri" w:cs="Calibri" w:eastAsia="Calibri" w:hAnsi="Calibri"/>
+          <w:b/>
+          <w:bCs/>
+          <w:sz w:val="22"/>
+          <w:szCs w:val="22"/>
+        </w:rPr>
+        <w:t xml:space="preserve">Task 5: Board Member Policy Proposal Workspace — </w:t>
+      </w:r>
+      <w:r>
+        <w:rPr>
+          <w:rFonts w:ascii="Calibri" w:cs="Calibri" w:eastAsia="Calibri" w:hAnsi="Calibri"/>
+          <w:sz w:val="22"/>
+          <w:szCs w:val="22"/>
+        </w:rPr>
+        <w:t xml:space="preserve">Dedicated view for drafting and submitting resolutions for presidential approval.</w:t>
+      </w:r>
+      <w:r>
+        <w:rPr>
+          <w:rFonts w:ascii="Calibri" w:cs="Calibri" w:eastAsia="Calibri" w:hAnsi="Calibri"/>
+          <w:i/>
+          <w:iCs/>
+          <w:sz w:val="22"/>
+          <w:szCs w:val="22"/>
+        </w:rPr>
+        <w:t xml:space="preserve"> Completed on October 20, 2026.</w:t>
+      </w:r>
+    </w:p>
+    <w:p>
+      <w:pPr>
+        <w:pStyle w:val="ListParagraph"/>
+        <w:numPr>
+          <w:ilvl w:val="0"/>
+          <w:numId w:val="1"/>
+        </w:numPr>
+        <w:spacing w:after="80" w:line="276"/>
+      </w:pPr>
+      <w:r>
+        <w:rPr>
+          <w:rFonts w:ascii="Calibri" w:cs="Calibri" w:eastAsia="Calibri" w:hAnsi="Calibri"/>
+          <w:b/>
+          <w:bCs/>
+          <w:sz w:val="22"/>
+          <w:szCs w:val="22"/>
+        </w:rPr>
+        <w:t xml:space="preserve">Task 6: API Sync Route Consolidation &amp; Strict Typing — </w:t>
+      </w:r>
+      <w:r>
+        <w:rPr>
+          <w:rFonts w:ascii="Calibri" w:cs="Calibri" w:eastAsia="Calibri" w:hAnsi="Calibri"/>
+          <w:sz w:val="22"/>
+          <w:szCs w:val="22"/>
+        </w:rPr>
+        <w:t xml:space="preserve">Delegated serverless handlers and validated push payloads.</w:t>
+      </w:r>
+      <w:r>
+        <w:rPr>
+          <w:rFonts w:ascii="Calibri" w:cs="Calibri" w:eastAsia="Calibri" w:hAnsi="Calibri"/>
+          <w:i/>
+          <w:iCs/>
+          <w:sz w:val="22"/>
+          <w:szCs w:val="22"/>
+        </w:rPr>
+        <w:t xml:space="preserve"> Completed on October 21, 2026.</w:t>
+      </w:r>
+    </w:p>
+    <w:p>
+      <w:pPr>
+        <w:pStyle w:val="ListParagraph"/>
+        <w:numPr>
+          <w:ilvl w:val="0"/>
+          <w:numId w:val="1"/>
+        </w:numPr>
+        <w:spacing w:after="80" w:line="276"/>
+      </w:pPr>
+      <w:r>
+        <w:rPr>
+          <w:rFonts w:ascii="Calibri" w:cs="Calibri" w:eastAsia="Calibri" w:hAnsi="Calibri"/>
+          <w:b/>
+          <w:bCs/>
+          <w:sz w:val="22"/>
+          <w:szCs w:val="22"/>
+        </w:rPr>
+        <w:t xml:space="preserve">Task 7: Treasury Monthly Chart Calculation Extraction — </w:t>
+      </w:r>
+      <w:r>
+        <w:rPr>
+          <w:rFonts w:ascii="Calibri" w:cs="Calibri" w:eastAsia="Calibri" w:hAnsi="Calibri"/>
+          <w:sz w:val="22"/>
+          <w:szCs w:val="22"/>
+        </w:rPr>
+        <w:t xml:space="preserve">Extracted pure aggregation helper aggregateMonthlyChartData.</w:t>
+      </w:r>
+      <w:r>
+        <w:rPr>
+          <w:rFonts w:ascii="Calibri" w:cs="Calibri" w:eastAsia="Calibri" w:hAnsi="Calibri"/>
+          <w:i/>
+          <w:iCs/>
+          <w:sz w:val="22"/>
+          <w:szCs w:val="22"/>
+        </w:rPr>
+        <w:t xml:space="preserve"> Completed on October 21, 2026.</w:t>
+      </w:r>
+    </w:p>
+    <w:p>
+      <w:pPr>
+        <w:pStyle w:val="ListParagraph"/>
+        <w:numPr>
+          <w:ilvl w:val="0"/>
+          <w:numId w:val="1"/>
+        </w:numPr>
+        <w:spacing w:after="80" w:line="276"/>
+      </w:pPr>
+      <w:r>
+        <w:rPr>
+          <w:rFonts w:ascii="Calibri" w:cs="Calibri" w:eastAsia="Calibri" w:hAnsi="Calibri"/>
+          <w:b/>
+          <w:bCs/>
+          <w:sz w:val="22"/>
+          <w:szCs w:val="22"/>
+        </w:rPr>
+        <w:t xml:space="preserve">Task 8: Web Crypto Client Storage Test Suite — </w:t>
+      </w:r>
+      <w:r>
+        <w:rPr>
+          <w:rFonts w:ascii="Calibri" w:cs="Calibri" w:eastAsia="Calibri" w:hAnsi="Calibri"/>
+          <w:sz w:val="22"/>
+          <w:szCs w:val="22"/>
+        </w:rPr>
+        <w:t xml:space="preserve">Created unit test suite for AES-GCM encryption, decryption, and migration.</w:t>
+      </w:r>
+      <w:r>
+        <w:rPr>
+          <w:rFonts w:ascii="Calibri" w:cs="Calibri" w:eastAsia="Calibri" w:hAnsi="Calibri"/>
+          <w:i/>
+          <w:iCs/>
+          <w:sz w:val="22"/>
+          <w:szCs w:val="22"/>
+        </w:rPr>
+        <w:t xml:space="preserve"> Completed on October 21, 2026.</w:t>
+      </w:r>
+    </w:p>
+    <w:p>
+      <w:pPr>
+        <w:pStyle w:val="ListParagraph"/>
+        <w:numPr>
+          <w:ilvl w:val="0"/>
+          <w:numId w:val="1"/>
+        </w:numPr>
+        <w:spacing w:after="80" w:line="276"/>
+      </w:pPr>
+      <w:r>
+        <w:rPr>
+          <w:rFonts w:ascii="Calibri" w:cs="Calibri" w:eastAsia="Calibri" w:hAnsi="Calibri"/>
+          <w:b/>
+          <w:bCs/>
+          <w:sz w:val="22"/>
+          <w:szCs w:val="22"/>
+        </w:rPr>
+        <w:t xml:space="preserve">Task 9: Fully-Typed Client State Hydration — </w:t>
+      </w:r>
+      <w:r>
+        <w:rPr>
+          <w:rFonts w:ascii="Calibri" w:cs="Calibri" w:eastAsia="Calibri" w:hAnsi="Calibri"/>
+          <w:sz w:val="22"/>
+          <w:szCs w:val="22"/>
+        </w:rPr>
+        <w:t xml:space="preserve">Replaced any with concrete types across all 13 storage entities.</w:t>
+      </w:r>
+      <w:r>
+        <w:rPr>
+          <w:rFonts w:ascii="Calibri" w:cs="Calibri" w:eastAsia="Calibri" w:hAnsi="Calibri"/>
+          <w:i/>
+          <w:iCs/>
+          <w:sz w:val="22"/>
+          <w:szCs w:val="22"/>
+        </w:rPr>
+        <w:t xml:space="preserve"> Completed on October 21, 2026.</w:t>
+      </w:r>
+    </w:p>
+    <w:p>
+      <w:pPr>
+        <w:spacing w:after="80" w:before="180"/>
+      </w:pPr>
+      <w:r>
+        <w:rPr>
+          <w:rFonts w:ascii="Calibri" w:cs="Calibri" w:eastAsia="Calibri" w:hAnsi="Calibri"/>
+          <w:b/>
+          <w:bCs/>
+          <w:color w:val="2D6A4F"/>
+          <w:sz w:val="23"/>
+          <w:szCs w:val="23"/>
+        </w:rPr>
+        <w:t xml:space="preserve">Tasks In Progress:</w:t>
+      </w:r>
+    </w:p>
+    <w:p>
+      <w:pPr>
+        <w:pStyle w:val="ListParagraph"/>
+        <w:numPr>
+          <w:ilvl w:val="0"/>
+          <w:numId w:val="1"/>
+        </w:numPr>
+        <w:spacing w:after="80" w:line="276"/>
+      </w:pPr>
+      <w:r>
+        <w:rPr>
+          <w:rFonts w:ascii="Calibri" w:cs="Calibri" w:eastAsia="Calibri" w:hAnsi="Calibri"/>
+          <w:b/>
+          <w:bCs/>
+          <w:sz w:val="22"/>
+          <w:szCs w:val="22"/>
+        </w:rPr>
+        <w:t xml:space="preserve">Task 10: Final Officer User Acceptance Testing (UAT) Dry Run — </w:t>
+      </w:r>
+      <w:r>
+        <w:rPr>
+          <w:rFonts w:ascii="Calibri" w:cs="Calibri" w:eastAsia="Calibri" w:hAnsi="Calibri"/>
+          <w:sz w:val="22"/>
+          <w:szCs w:val="22"/>
+        </w:rPr>
+        <w:t xml:space="preserve">Execute field trials with Barangay Alegria association officers using staged mobile devices.</w:t>
+      </w:r>
+      <w:r>
+        <w:rPr>
+          <w:rFonts w:ascii="Calibri" w:cs="Calibri" w:eastAsia="Calibri" w:hAnsi="Calibri"/>
+          <w:i/>
+          <w:iCs/>
+          <w:sz w:val="22"/>
+          <w:szCs w:val="22"/>
+        </w:rPr>
+        <w:t xml:space="preserve"> Estimated completion: October 23, 2026.</w:t>
+      </w:r>
+    </w:p>
+    <w:p>
+      <w:pPr>
+        <w:pStyle w:val="ListParagraph"/>
+        <w:numPr>
+          <w:ilvl w:val="0"/>
+          <w:numId w:val="1"/>
+        </w:numPr>
+        <w:spacing w:after="80" w:line="276"/>
+      </w:pPr>
+      <w:r>
+        <w:rPr>
+          <w:rFonts w:ascii="Calibri" w:cs="Calibri" w:eastAsia="Calibri" w:hAnsi="Calibri"/>
+          <w:b/>
+          <w:bCs/>
+          <w:sz w:val="22"/>
+          <w:szCs w:val="22"/>
+        </w:rPr>
+        <w:t xml:space="preserve">Task 11: Production Deployment Staging &amp; Documentation Freeze — </w:t>
+      </w:r>
+      <w:r>
+        <w:rPr>
+          <w:rFonts w:ascii="Calibri" w:cs="Calibri" w:eastAsia="Calibri" w:hAnsi="Calibri"/>
+          <w:sz w:val="22"/>
+          <w:szCs w:val="22"/>
+        </w:rPr>
+        <w:t xml:space="preserve">Final verification on Vercel and Supabase production environments with updated user manuals.</w:t>
+      </w:r>
+      <w:r>
+        <w:rPr>
+          <w:rFonts w:ascii="Calibri" w:cs="Calibri" w:eastAsia="Calibri" w:hAnsi="Calibri"/>
+          <w:i/>
+          <w:iCs/>
+          <w:sz w:val="22"/>
+          <w:szCs w:val="22"/>
+        </w:rPr>
+        <w:t xml:space="preserve"> Estimated completion: October 23, 2026.</w:t>
+      </w:r>
+    </w:p>
+    <w:p>
+      <w:pPr>
+        <w:spacing w:after="80" w:before="180"/>
+      </w:pPr>
+      <w:r>
+        <w:rPr>
+          <w:rFonts w:ascii="Calibri" w:cs="Calibri" w:eastAsia="Calibri" w:hAnsi="Calibri"/>
+          <w:b/>
+          <w:bCs/>
+          <w:color w:val="2D6A4F"/>
+          <w:sz w:val="23"/>
+          <w:szCs w:val="23"/>
+        </w:rPr>
+        <w:t xml:space="preserve">Blocked Tasks:</w:t>
+      </w:r>
+    </w:p>
+    <w:p>
+      <w:pPr>
+        <w:spacing w:after="120" w:before="0" w:line="276"/>
+      </w:pPr>
+      <w:r>
+        <w:rPr>
+          <w:rFonts w:ascii="Calibri" w:cs="Calibri" w:eastAsia="Calibri" w:hAnsi="Calibri"/>
+          <w:sz w:val="22"/>
+          <w:szCs w:val="22"/>
+        </w:rPr>
+        <w:t xml:space="preserve">None. All 15 automated test suites pass, TypeScript compiles with zero errors in application logic, and database migrations run cleanly.</w:t>
+      </w:r>
+    </w:p>
+    <w:p>
+      <w:pPr>
+        <w:spacing w:after="120" w:before="240"/>
+      </w:pPr>
+      <w:r>
+        <w:rPr>
+          <w:rFonts w:ascii="Calibri" w:cs="Calibri" w:eastAsia="Calibri" w:hAnsi="Calibri"/>
+          <w:b/>
+          <w:bCs/>
+          <w:color w:val="1B4332"/>
+          <w:sz w:val="26"/>
+          <w:szCs w:val="26"/>
+        </w:rPr>
+        <w:t xml:space="preserve">3. Assigned Member and Role</w:t>
+      </w:r>
+    </w:p>
+    <w:tbl>
+      <w:tblPr>
+        <w:tblW w:type="pct" w:w="100%"/>
+        <w:tblBorders>
+          <w:top w:val="single" w:color="D5CFC1" w:sz="4"/>
+          <w:left w:val="single" w:color="D5CFC1" w:sz="4"/>
+          <w:bottom w:val="single" w:color="D5CFC1" w:sz="4"/>
+          <w:right w:val="single" w:color="D5CFC1" w:sz="4"/>
+          <w:insideH w:val="single" w:color="D5CFC1" w:sz="4"/>
+          <w:insideV w:val="single" w:color="D5CFC1" w:sz="4"/>
+        </w:tblBorders>
+      </w:tblPr>
+      <w:tblGrid>
+        <w:gridCol w:w="100"/>
+        <w:gridCol w:w="100"/>
+        <w:gridCol w:w="100"/>
+      </w:tblGrid>
+      <w:tr>
+        <w:trPr>
+          <w:tblHeader/>
+        </w:trPr>
+        <w:tc>
+          <w:tcPr>
+            <w:tcW w:type="pct" w:w="22%"/>
+            <w:shd w:fill="1B4332" w:val="clear"/>
+            <w:tcMar>
+              <w:top w:type="dxa" w:w="60"/>
+              <w:left w:type="dxa" w:w="100"/>
+              <w:bottom w:type="dxa" w:w="60"/>
+              <w:right w:type="dxa" w:w="100"/>
+            </w:tcMar>
+          </w:tcPr>
+          <w:p>
+            <w:pPr>
+              <w:spacing w:after="0"/>
+            </w:pPr>
+            <w:r>
+              <w:rPr>
+                <w:rFonts w:ascii="Calibri" w:cs="Calibri" w:eastAsia="Calibri" w:hAnsi="Calibri"/>
+                <w:b/>
+                <w:bCs/>
+                <w:color w:val="FFFFFF"/>
+                <w:sz w:val="20"/>
+                <w:szCs w:val="20"/>
+              </w:rPr>
+              <w:t xml:space="preserve">Member Name</w:t>
+            </w:r>
+          </w:p>
+        </w:tc>
+        <w:tc>
+          <w:tcPr>
+            <w:tcW w:type="pct" w:w="28%"/>
+            <w:shd w:fill="1B4332" w:val="clear"/>
+            <w:tcMar>
+              <w:top w:type="dxa" w:w="60"/>
+              <w:left w:type="dxa" w:w="100"/>
+              <w:bottom w:type="dxa" w:w="60"/>
+              <w:right w:type="dxa" w:w="100"/>
+            </w:tcMar>
+          </w:tcPr>
+          <w:p>
+            <w:pPr>
+              <w:spacing w:after="0"/>
+            </w:pPr>
+            <w:r>
+              <w:rPr>
+                <w:rFonts w:ascii="Calibri" w:cs="Calibri" w:eastAsia="Calibri" w:hAnsi="Calibri"/>
+                <w:b/>
+                <w:bCs/>
+                <w:color w:val="FFFFFF"/>
+                <w:sz w:val="20"/>
+                <w:szCs w:val="20"/>
+              </w:rPr>
+              <w:t xml:space="preserve">Role</w:t>
+            </w:r>
+          </w:p>
+        </w:tc>
+        <w:tc>
+          <w:tcPr>
+            <w:tcW w:type="pct" w:w="50%"/>
+            <w:shd w:fill="1B4332" w:val="clear"/>
+            <w:tcMar>
+              <w:top w:type="dxa" w:w="60"/>
+              <w:left w:type="dxa" w:w="100"/>
+              <w:bottom w:type="dxa" w:w="60"/>
+              <w:right w:type="dxa" w:w="100"/>
+            </w:tcMar>
+          </w:tcPr>
+          <w:p>
+            <w:pPr>
+              <w:spacing w:after="0"/>
+            </w:pPr>
+            <w:r>
+              <w:rPr>
+                <w:rFonts w:ascii="Calibri" w:cs="Calibri" w:eastAsia="Calibri" w:hAnsi="Calibri"/>
+                <w:b/>
+                <w:bCs/>
+                <w:color w:val="FFFFFF"/>
+                <w:sz w:val="20"/>
+                <w:szCs w:val="20"/>
+              </w:rPr>
+              <w:t xml:space="preserve">Responsibilities</w:t>
+            </w:r>
+          </w:p>
+        </w:tc>
+      </w:tr>
+      <w:tr>
+        <w:tc>
+          <w:tcPr>
+            <w:tcW w:type="pct" w:w="22%"/>
+            <w:tcMar>
+              <w:top w:type="dxa" w:w="60"/>
+              <w:left w:type="dxa" w:w="100"/>
+              <w:bottom w:type="dxa" w:w="60"/>
+              <w:right w:type="dxa" w:w="100"/>
+            </w:tcMar>
+          </w:tcPr>
+          <w:p>
+            <w:pPr>
+              <w:spacing w:after="0"/>
+            </w:pPr>
+            <w:r>
+              <w:rPr>
+                <w:rFonts w:ascii="Calibri" w:cs="Calibri" w:eastAsia="Calibri" w:hAnsi="Calibri"/>
+                <w:sz w:val="20"/>
+                <w:szCs w:val="20"/>
+              </w:rPr>
+              <w:t xml:space="preserve">Ronar Diamante</w:t>
+            </w:r>
+          </w:p>
+        </w:tc>
+        <w:tc>
+          <w:tcPr>
+            <w:tcW w:type="pct" w:w="28%"/>
+            <w:tcMar>
+              <w:top w:type="dxa" w:w="60"/>
+              <w:left w:type="dxa" w:w="100"/>
+              <w:bottom w:type="dxa" w:w="60"/>
+              <w:right w:type="dxa" w:w="100"/>
+            </w:tcMar>
+          </w:tcPr>
+          <w:p>
+            <w:pPr>
+              <w:spacing w:after="0"/>
+            </w:pPr>
+            <w:r>
+              <w:rPr>
+                <w:rFonts w:ascii="Calibri" w:cs="Calibri" w:eastAsia="Calibri" w:hAnsi="Calibri"/>
+                <w:sz w:val="20"/>
+                <w:szCs w:val="20"/>
+              </w:rPr>
+              <w:t xml:space="preserve">Lead System Architect &amp; Backend Developer</w:t>
+            </w:r>
+          </w:p>
+        </w:tc>
+        <w:tc>
+          <w:tcPr>
+            <w:tcW w:type="pct" w:w="50%"/>
+            <w:tcMar>
+              <w:top w:type="dxa" w:w="60"/>
+              <w:left w:type="dxa" w:w="100"/>
+              <w:bottom w:type="dxa" w:w="60"/>
+              <w:right w:type="dxa" w:w="100"/>
+            </w:tcMar>
+          </w:tcPr>
+          <w:p>
+            <w:pPr>
+              <w:spacing w:after="0"/>
+            </w:pPr>
+            <w:r>
+              <w:rPr>
+                <w:rFonts w:ascii="Calibri" w:cs="Calibri" w:eastAsia="Calibri" w:hAnsi="Calibri"/>
+                <w:sz w:val="20"/>
+                <w:szCs w:val="20"/>
+              </w:rPr>
+              <w:t xml:space="preserve">System architecture, PostgreSQL schema design, offline PWA sync engine, Vercel build pipeline, cloud deployments, security implementation, code review</w:t>
+            </w:r>
+          </w:p>
+        </w:tc>
+      </w:tr>
+      <w:tr>
+        <w:tc>
+          <w:tcPr>
+            <w:tcW w:type="pct" w:w="22%"/>
+            <w:shd w:fill="F7F4EF" w:val="clear"/>
+            <w:tcMar>
+              <w:top w:type="dxa" w:w="60"/>
+              <w:left w:type="dxa" w:w="100"/>
+              <w:bottom w:type="dxa" w:w="60"/>
+              <w:right w:type="dxa" w:w="100"/>
+            </w:tcMar>
+          </w:tcPr>
+          <w:p>
+            <w:pPr>
+              <w:spacing w:after="0"/>
+            </w:pPr>
+            <w:r>
+              <w:rPr>
+                <w:rFonts w:ascii="Calibri" w:cs="Calibri" w:eastAsia="Calibri" w:hAnsi="Calibri"/>
+                <w:sz w:val="20"/>
+                <w:szCs w:val="20"/>
+              </w:rPr>
+              <w:t xml:space="preserve">Joshua Pesiao</w:t>
+            </w:r>
+          </w:p>
+        </w:tc>
+        <w:tc>
+          <w:tcPr>
+            <w:tcW w:type="pct" w:w="28%"/>
+            <w:shd w:fill="F7F4EF" w:val="clear"/>
+            <w:tcMar>
+              <w:top w:type="dxa" w:w="60"/>
+              <w:left w:type="dxa" w:w="100"/>
+              <w:bottom w:type="dxa" w:w="60"/>
+              <w:right w:type="dxa" w:w="100"/>
+            </w:tcMar>
+          </w:tcPr>
+          <w:p>
+            <w:pPr>
+              <w:spacing w:after="0"/>
+            </w:pPr>
+            <w:r>
+              <w:rPr>
+                <w:rFonts w:ascii="Calibri" w:cs="Calibri" w:eastAsia="Calibri" w:hAnsi="Calibri"/>
+                <w:sz w:val="20"/>
+                <w:szCs w:val="20"/>
+              </w:rPr>
+              <w:t xml:space="preserve">Frontend Developer &amp; UI/UX Designer</w:t>
+            </w:r>
+          </w:p>
+        </w:tc>
+        <w:tc>
+          <w:tcPr>
+            <w:tcW w:type="pct" w:w="50%"/>
+            <w:shd w:fill="F7F4EF" w:val="clear"/>
+            <w:tcMar>
+              <w:top w:type="dxa" w:w="60"/>
+              <w:left w:type="dxa" w:w="100"/>
+              <w:bottom w:type="dxa" w:w="60"/>
+              <w:right w:type="dxa" w:w="100"/>
+            </w:tcMar>
+          </w:tcPr>
+          <w:p>
+            <w:pPr>
+              <w:spacing w:after="0"/>
+            </w:pPr>
+            <w:r>
+              <w:rPr>
+                <w:rFonts w:ascii="Calibri" w:cs="Calibri" w:eastAsia="Calibri" w:hAnsi="Calibri"/>
+                <w:sz w:val="20"/>
+                <w:szCs w:val="20"/>
+              </w:rPr>
+              <w:t xml:space="preserve">React component development, responsive design, PWA offline UI/UX, form validation, API integration, loading states, error handling, design system</w:t>
+            </w:r>
+          </w:p>
+        </w:tc>
+      </w:tr>
+      <w:tr>
+        <w:tc>
+          <w:tcPr>
+            <w:tcW w:type="pct" w:w="22%"/>
+            <w:tcMar>
+              <w:top w:type="dxa" w:w="60"/>
+              <w:left w:type="dxa" w:w="100"/>
+              <w:bottom w:type="dxa" w:w="60"/>
+              <w:right w:type="dxa" w:w="100"/>
+            </w:tcMar>
+          </w:tcPr>
+          <w:p>
+            <w:pPr>
+              <w:spacing w:after="0"/>
+            </w:pPr>
+            <w:r>
+              <w:rPr>
+                <w:rFonts w:ascii="Calibri" w:cs="Calibri" w:eastAsia="Calibri" w:hAnsi="Calibri"/>
+                <w:sz w:val="20"/>
+                <w:szCs w:val="20"/>
+              </w:rPr>
+              <w:t xml:space="preserve">Aella Marie Agsoy</w:t>
+            </w:r>
+          </w:p>
+        </w:tc>
+        <w:tc>
+          <w:tcPr>
+            <w:tcW w:type="pct" w:w="28%"/>
+            <w:tcMar>
+              <w:top w:type="dxa" w:w="60"/>
+              <w:left w:type="dxa" w:w="100"/>
+              <w:bottom w:type="dxa" w:w="60"/>
+              <w:right w:type="dxa" w:w="100"/>
+            </w:tcMar>
+          </w:tcPr>
+          <w:p>
+            <w:pPr>
+              <w:spacing w:after="0"/>
+            </w:pPr>
+            <w:r>
+              <w:rPr>
+                <w:rFonts w:ascii="Calibri" w:cs="Calibri" w:eastAsia="Calibri" w:hAnsi="Calibri"/>
+                <w:sz w:val="20"/>
+                <w:szCs w:val="20"/>
+              </w:rPr>
+              <w:t xml:space="preserve">QA &amp; Security Tester</w:t>
+            </w:r>
+          </w:p>
+        </w:tc>
+        <w:tc>
+          <w:tcPr>
+            <w:tcW w:type="pct" w:w="50%"/>
+            <w:tcMar>
+              <w:top w:type="dxa" w:w="60"/>
+              <w:left w:type="dxa" w:w="100"/>
+              <w:bottom w:type="dxa" w:w="60"/>
+              <w:right w:type="dxa" w:w="100"/>
+            </w:tcMar>
+          </w:tcPr>
+          <w:p>
+            <w:pPr>
+              <w:spacing w:after="0"/>
+            </w:pPr>
+            <w:r>
+              <w:rPr>
+                <w:rFonts w:ascii="Calibri" w:cs="Calibri" w:eastAsia="Calibri" w:hAnsi="Calibri"/>
+                <w:sz w:val="20"/>
+                <w:szCs w:val="20"/>
+              </w:rPr>
+              <w:t xml:space="preserve">Test plan creation, functional testing, regression testing, API testing, bug tracking, security testing, performance testing, cross-browser compatibility</w:t>
+            </w:r>
+          </w:p>
+        </w:tc>
+      </w:tr>
+      <w:tr>
+        <w:tc>
+          <w:tcPr>
+            <w:tcW w:type="pct" w:w="22%"/>
+            <w:shd w:fill="F7F4EF" w:val="clear"/>
+            <w:tcMar>
+              <w:top w:type="dxa" w:w="60"/>
+              <w:left w:type="dxa" w:w="100"/>
+              <w:bottom w:type="dxa" w:w="60"/>
+              <w:right w:type="dxa" w:w="100"/>
+            </w:tcMar>
+          </w:tcPr>
+          <w:p>
+            <w:pPr>
+              <w:spacing w:after="0"/>
+            </w:pPr>
+            <w:r>
+              <w:rPr>
+                <w:rFonts w:ascii="Calibri" w:cs="Calibri" w:eastAsia="Calibri" w:hAnsi="Calibri"/>
+                <w:sz w:val="20"/>
+                <w:szCs w:val="20"/>
+              </w:rPr>
+              <w:t xml:space="preserve">Honey Blare Gargar</w:t>
+            </w:r>
+          </w:p>
+        </w:tc>
+        <w:tc>
+          <w:tcPr>
+            <w:tcW w:type="pct" w:w="28%"/>
+            <w:shd w:fill="F7F4EF" w:val="clear"/>
+            <w:tcMar>
+              <w:top w:type="dxa" w:w="60"/>
+              <w:left w:type="dxa" w:w="100"/>
+              <w:bottom w:type="dxa" w:w="60"/>
+              <w:right w:type="dxa" w:w="100"/>
+            </w:tcMar>
+          </w:tcPr>
+          <w:p>
+            <w:pPr>
+              <w:spacing w:after="0"/>
+            </w:pPr>
+            <w:r>
+              <w:rPr>
+                <w:rFonts w:ascii="Calibri" w:cs="Calibri" w:eastAsia="Calibri" w:hAnsi="Calibri"/>
+                <w:sz w:val="20"/>
+                <w:szCs w:val="20"/>
+              </w:rPr>
+              <w:t xml:space="preserve">Documentation Lead</w:t>
+            </w:r>
+          </w:p>
+        </w:tc>
+        <w:tc>
+          <w:tcPr>
+            <w:tcW w:type="pct" w:w="50%"/>
+            <w:shd w:fill="F7F4EF" w:val="clear"/>
+            <w:tcMar>
+              <w:top w:type="dxa" w:w="60"/>
+              <w:left w:type="dxa" w:w="100"/>
+              <w:bottom w:type="dxa" w:w="60"/>
+              <w:right w:type="dxa" w:w="100"/>
+            </w:tcMar>
+          </w:tcPr>
+          <w:p>
+            <w:pPr>
+              <w:spacing w:after="0"/>
+            </w:pPr>
+            <w:r>
+              <w:rPr>
+                <w:rFonts w:ascii="Calibri" w:cs="Calibri" w:eastAsia="Calibri" w:hAnsi="Calibri"/>
+                <w:sz w:val="20"/>
+                <w:szCs w:val="20"/>
+              </w:rPr>
+              <w:t xml:space="preserve">Technical documentation, user manuals, API documentation, deployment guides, meeting minutes, requirements gathering, stakeholder interviews, research</w:t>
+            </w:r>
+          </w:p>
+        </w:tc>
+      </w:tr>
+    </w:tbl>
+    <w:p>
+      <w:pPr>
+        <w:spacing w:after="80" w:before="0" w:line="276"/>
+      </w:pPr>
+      <w:r>
+        <w:rPr>
+          <w:rFonts w:ascii="Calibri" w:cs="Calibri" w:eastAsia="Calibri" w:hAnsi="Calibri"/>
+          <w:sz w:val="22"/>
+          <w:szCs w:val="22"/>
+        </w:rPr>
+        <w:t xml:space="preserve"/>
+      </w:r>
+    </w:p>
+    <w:p>
+      <w:pPr>
+        <w:spacing w:after="120" w:before="240"/>
+      </w:pPr>
+      <w:r>
+        <w:rPr>
+          <w:rFonts w:ascii="Calibri" w:cs="Calibri" w:eastAsia="Calibri" w:hAnsi="Calibri"/>
+          <w:b/>
+          <w:bCs/>
+          <w:color w:val="1B4332"/>
+          <w:sz w:val="26"/>
+          <w:szCs w:val="26"/>
+        </w:rPr>
+        <w:t xml:space="preserve">4. Upcoming Milestones</w:t>
+      </w:r>
+    </w:p>
+    <w:p>
+      <w:pPr>
+        <w:pStyle w:val="ListParagraph"/>
+        <w:numPr>
+          <w:ilvl w:val="0"/>
+          <w:numId w:val="1"/>
+        </w:numPr>
+        <w:spacing w:after="80" w:line="276"/>
+      </w:pPr>
+      <w:r>
+        <w:rPr>
+          <w:rFonts w:ascii="Calibri" w:cs="Calibri" w:eastAsia="Calibri" w:hAnsi="Calibri"/>
+          <w:b/>
+          <w:bCs/>
+          <w:sz w:val="22"/>
+          <w:szCs w:val="22"/>
+        </w:rPr>
+        <w:t xml:space="preserve">Milestone: </w:t>
+      </w:r>
+      <w:r>
+        <w:rPr>
+          <w:rFonts w:ascii="Calibri" w:cs="Calibri" w:eastAsia="Calibri" w:hAnsi="Calibri"/>
+          <w:sz w:val="22"/>
+          <w:szCs w:val="22"/>
+        </w:rPr>
+        <w:t xml:space="preserve">Production Release 1.2 &amp; Officer Field Sign-Off</w:t>
+      </w:r>
+    </w:p>
+    <w:p>
+      <w:pPr>
+        <w:pStyle w:val="ListParagraph"/>
+        <w:numPr>
+          <w:ilvl w:val="1"/>
+          <w:numId w:val="1"/>
+        </w:numPr>
+        <w:spacing w:after="80" w:line="276"/>
+      </w:pPr>
+      <w:r>
+        <w:rPr>
+          <w:rFonts w:ascii="Calibri" w:cs="Calibri" w:eastAsia="Calibri" w:hAnsi="Calibri"/>
+          <w:b/>
+          <w:bCs/>
+          <w:sz w:val="22"/>
+          <w:szCs w:val="22"/>
+        </w:rPr>
+        <w:t xml:space="preserve">Target Date: </w:t>
+      </w:r>
+      <w:r>
+        <w:rPr>
+          <w:rFonts w:ascii="Calibri" w:cs="Calibri" w:eastAsia="Calibri" w:hAnsi="Calibri"/>
+          <w:sz w:val="22"/>
+          <w:szCs w:val="22"/>
+        </w:rPr>
+        <w:t xml:space="preserve">October 23, 2026</w:t>
+      </w:r>
+    </w:p>
+    <w:p>
+      <w:pPr>
+        <w:pStyle w:val="ListParagraph"/>
+        <w:numPr>
+          <w:ilvl w:val="1"/>
+          <w:numId w:val="1"/>
+        </w:numPr>
+        <w:spacing w:after="80" w:line="276"/>
+      </w:pPr>
+      <w:r>
+        <w:rPr>
+          <w:rFonts w:ascii="Calibri" w:cs="Calibri" w:eastAsia="Calibri" w:hAnsi="Calibri"/>
+          <w:b/>
+          <w:bCs/>
+          <w:sz w:val="22"/>
+          <w:szCs w:val="22"/>
+        </w:rPr>
+        <w:t xml:space="preserve">Key Deliverables:</w:t>
+      </w:r>
+    </w:p>
+    <w:p>
+      <w:pPr>
+        <w:pStyle w:val="ListParagraph"/>
+        <w:numPr>
+          <w:ilvl w:val="2"/>
+          <w:numId w:val="1"/>
+        </w:numPr>
+        <w:spacing w:after="80" w:line="276"/>
+      </w:pPr>
+      <w:r>
+        <w:rPr>
+          <w:rFonts w:ascii="Calibri" w:cs="Calibri" w:eastAsia="Calibri" w:hAnsi="Calibri"/>
+          <w:sz w:val="22"/>
+          <w:szCs w:val="22"/>
+        </w:rPr>
+        <w:t xml:space="preserve">Successful officer UAT dry run in Barangay Alegria.</w:t>
+      </w:r>
+    </w:p>
+    <w:p>
+      <w:pPr>
+        <w:pStyle w:val="ListParagraph"/>
+        <w:numPr>
+          <w:ilvl w:val="2"/>
+          <w:numId w:val="1"/>
+        </w:numPr>
+        <w:spacing w:after="80" w:line="276"/>
+      </w:pPr>
+      <w:r>
+        <w:rPr>
+          <w:rFonts w:ascii="Calibri" w:cs="Calibri" w:eastAsia="Calibri" w:hAnsi="Calibri"/>
+          <w:sz w:val="22"/>
+          <w:szCs w:val="22"/>
+        </w:rPr>
+        <w:t xml:space="preserve">Verified data integrity across all 12 relational database tables.</w:t>
+      </w:r>
+    </w:p>
+    <w:p>
+      <w:pPr>
+        <w:pStyle w:val="ListParagraph"/>
+        <w:numPr>
+          <w:ilvl w:val="2"/>
+          <w:numId w:val="1"/>
+        </w:numPr>
+        <w:spacing w:after="80" w:line="276"/>
+      </w:pPr>
+      <w:r>
+        <w:rPr>
+          <w:rFonts w:ascii="Calibri" w:cs="Calibri" w:eastAsia="Calibri" w:hAnsi="Calibri"/>
+          <w:sz w:val="22"/>
+          <w:szCs w:val="22"/>
+        </w:rPr>
+        <w:t xml:space="preserve">Complete, audit-ready compliance reporting package for all officer roles.</w:t>
+      </w:r>
+    </w:p>
+    <w:p>
+      <w:pPr>
+        <w:pStyle w:val="ListParagraph"/>
+        <w:numPr>
+          <w:ilvl w:val="2"/>
+          <w:numId w:val="1"/>
+        </w:numPr>
+        <w:spacing w:after="80" w:line="276"/>
+      </w:pPr>
+      <w:r>
+        <w:rPr>
+          <w:rFonts w:ascii="Calibri" w:cs="Calibri" w:eastAsia="Calibri" w:hAnsi="Calibri"/>
+          <w:sz w:val="22"/>
+          <w:szCs w:val="22"/>
+        </w:rPr>
+        <w:t xml:space="preserve">Formal production cutover on Vercel and Supabase.</w:t>
+      </w:r>
+    </w:p>
+    <w:p>
+      <w:pPr>
+        <w:pStyle w:val="ListParagraph"/>
+        <w:numPr>
+          <w:ilvl w:val="0"/>
+          <w:numId w:val="1"/>
+        </w:numPr>
+        <w:spacing w:after="80" w:line="276"/>
+      </w:pPr>
+      <w:r>
+        <w:rPr>
+          <w:rFonts w:ascii="Calibri" w:cs="Calibri" w:eastAsia="Calibri" w:hAnsi="Calibri"/>
+          <w:b/>
+          <w:bCs/>
+          <w:sz w:val="22"/>
+          <w:szCs w:val="22"/>
+        </w:rPr>
+        <w:t xml:space="preserve">Next Steps: </w:t>
+      </w:r>
+      <w:r>
+        <w:rPr>
+          <w:rFonts w:ascii="Calibri" w:cs="Calibri" w:eastAsia="Calibri" w:hAnsi="Calibri"/>
+          <w:sz w:val="22"/>
+          <w:szCs w:val="22"/>
+        </w:rPr>
+        <w:t xml:space="preserve">Distribute release candidate build to officer devices for live field validation during the upcoming general assembly.</w:t>
       </w:r>
     </w:p>
     <w:p>

</xml_diff>